<commit_message>
fix: sablonul de casa purta doua documente Word incorporate, deci toate actele generate le mosteneau
Gasit pe 3 august 2026, la controlul final al unui dosar gata de depunere: adresa de inaintare
continea word/embeddings/Microsoft_Word_Document.docx si Microsoft_Word_Document1.docx, plus
trei fisiere media. Cauza nu era in document, ci in assets/sablon-casa.docx, care le purta el
insusi. Fiecare act produs vreodata prin scrie_document.py sau creeaza_document.py le-a
mostenit, iar ele pleaca la instanta ascunse in fisier.

Sablonul e curatat la radacina, deci actele viitoare ies curate fara alta interventie.
Documentele deja livrate raman de curatat individual, cu curata_obiecte.py.

Co-Authored-By: Claude Opus 5 <noreply@anthropic.com>
</commit_message>
<xml_diff>
--- a/plugin/skills/docx-footnotes/assets/sablon-casa.docx
+++ b/plugin/skills/docx-footnotes/assets/sablon-casa.docx
@@ -430,46 +430,7 @@
       </w:drawing>
     </w:r>
     <w:r>
-      <w:object w:dxaOrig="1399" w:dyaOrig="905" w14:anchorId="715B05AB">
-        <v:shapetype id="_x0000_t75" coordsize="21600,21600" o:spt="75" o:preferrelative="t" path="m@4@5l@4@11@9@11@9@5xe" filled="f" stroked="f">
-          <v:stroke joinstyle="miter"/>
-          <v:formulas>
-            <v:f eqn="if lineDrawn pixelLineWidth 0"/>
-            <v:f eqn="sum @0 1 0"/>
-            <v:f eqn="sum 0 0 @1"/>
-            <v:f eqn="prod @2 1 2"/>
-            <v:f eqn="prod @3 21600 pixelWidth"/>
-            <v:f eqn="prod @3 21600 pixelHeight"/>
-            <v:f eqn="sum @0 0 1"/>
-            <v:f eqn="prod @6 1 2"/>
-            <v:f eqn="prod @7 21600 pixelWidth"/>
-            <v:f eqn="sum @8 21600 0"/>
-            <v:f eqn="prod @7 21600 pixelHeight"/>
-            <v:f eqn="sum @10 21600 0"/>
-          </v:formulas>
-          <v:path o:extrusionok="f" gradientshapeok="t" o:connecttype="rect"/>
-          <o:lock v:ext="edit" aspectratio="t"/>
-        </v:shapetype>
-        <v:shape id="_x0000_i1025" type="#_x0000_t75" style="width:70.5pt;height:45.75pt">
-          <v:imagedata r:id="rId2" o:title=""/>
-        </v:shape>
-        <o:OLEObject Type="Embed" ProgID="Word.Document.12" ShapeID="_x0000_i1025" DrawAspect="Icon" ObjectID="_1841312039" r:id="rId3">
-          <o:FieldCodes>\s</o:FieldCodes>
-        </o:OLEObject>
-      </w:object>
-    </w:r>
-    <w:r>
       <w:t xml:space="preserve"> </w:t>
-    </w:r>
-    <w:r>
-      <w:object w:dxaOrig="1399" w:dyaOrig="905" w14:anchorId="1881449B">
-        <v:shape id="_x0000_i1026" type="#_x0000_t75" style="width:70.5pt;height:45.75pt">
-          <v:imagedata r:id="rId4" o:title=""/>
-        </v:shape>
-        <o:OLEObject Type="Embed" ProgID="Word.Document.12" ShapeID="_x0000_i1026" DrawAspect="Icon" ObjectID="_1841312040" r:id="rId5">
-          <o:FieldCodes>\s</o:FieldCodes>
-        </o:OLEObject>
-      </w:object>
     </w:r>
   </w:p>
 </w:hdr>

</xml_diff>